<commit_message>
Pitch: replace phase timeline with monthly content cycle and add-ons
Co-Authored-By: Claude Opus 5.5 <noreply@anthropic.com>
Claude-Session: https://claude.ai/code/session_01L79zFsj3j3wYAWjFgWLRux
</commit_message>
<xml_diff>
--- a/docs/SMM_Dashboard_Pitch.docx
+++ b/docs/SMM_Dashboard_Pitch.docx
@@ -1037,7 +1037,7 @@
           <w:color w:val="1B2A5E"/>
           <w:sz w:val="22"/>
         </w:rPr>
-        <w:t>4. Starting first, then adding more</w:t>
+        <w:t>4. How the monthly cycle works (example: January content)</w:t>
       </w:r>
     </w:p>
     <w:tbl>
@@ -1069,13 +1069,279 @@
                 <w:b/>
                 <w:sz w:val="16"/>
               </w:rPr>
-              <w:t>Stage</w:t>
+              <w:t>When</w:t>
             </w:r>
           </w:p>
         </w:tc>
         <w:tc>
           <w:tcPr>
             <w:tcW w:type="dxa" w:w="7654"/>
+          </w:tcPr>
+          <w:p>
+            <w:pPr>
+              <w:spacing w:after="0"/>
+            </w:pPr>
+            <w:r>
+              <w:rPr>
+                <w:sz w:val="16"/>
+              </w:rPr>
+            </w:r>
+            <w:r>
+              <w:rPr>
+                <w:b/>
+                <w:sz w:val="16"/>
+              </w:rPr>
+              <w:t>What happens</w:t>
+            </w:r>
+          </w:p>
+        </w:tc>
+      </w:tr>
+      <w:tr>
+        <w:tc>
+          <w:tcPr>
+            <w:tcW w:type="dxa" w:w="1984"/>
+          </w:tcPr>
+          <w:p>
+            <w:pPr>
+              <w:spacing w:after="0"/>
+            </w:pPr>
+            <w:r>
+              <w:rPr>
+                <w:sz w:val="16"/>
+              </w:rPr>
+              <w:t>1 December</w:t>
+            </w:r>
+          </w:p>
+        </w:tc>
+        <w:tc>
+          <w:tcPr>
+            <w:tcW w:type="dxa" w:w="7654"/>
+          </w:tcPr>
+          <w:p>
+            <w:pPr>
+              <w:spacing w:after="0"/>
+            </w:pPr>
+            <w:r>
+              <w:rPr>
+                <w:sz w:val="16"/>
+              </w:rPr>
+              <w:t>Research starts; the AI prepares the January strategy</w:t>
+            </w:r>
+          </w:p>
+        </w:tc>
+      </w:tr>
+      <w:tr>
+        <w:tc>
+          <w:tcPr>
+            <w:tcW w:type="dxa" w:w="1984"/>
+          </w:tcPr>
+          <w:p>
+            <w:pPr>
+              <w:spacing w:after="0"/>
+            </w:pPr>
+            <w:r>
+              <w:rPr>
+                <w:sz w:val="16"/>
+              </w:rPr>
+              <w:t>Early December</w:t>
+            </w:r>
+          </w:p>
+        </w:tc>
+        <w:tc>
+          <w:tcPr>
+            <w:tcW w:type="dxa" w:w="7654"/>
+          </w:tcPr>
+          <w:p>
+            <w:pPr>
+              <w:spacing w:after="0"/>
+            </w:pPr>
+            <w:r>
+              <w:rPr>
+                <w:sz w:val="16"/>
+              </w:rPr>
+              <w:t>Strategy approved (or edited / rejected with a comment)</w:t>
+            </w:r>
+          </w:p>
+        </w:tc>
+      </w:tr>
+      <w:tr>
+        <w:tc>
+          <w:tcPr>
+            <w:tcW w:type="dxa" w:w="1984"/>
+          </w:tcPr>
+          <w:p>
+            <w:pPr>
+              <w:spacing w:after="0"/>
+            </w:pPr>
+            <w:r>
+              <w:rPr>
+                <w:sz w:val="16"/>
+              </w:rPr>
+              <w:t>Mid December</w:t>
+            </w:r>
+          </w:p>
+        </w:tc>
+        <w:tc>
+          <w:tcPr>
+            <w:tcW w:type="dxa" w:w="7654"/>
+          </w:tcPr>
+          <w:p>
+            <w:pPr>
+              <w:spacing w:after="0"/>
+            </w:pPr>
+            <w:r>
+              <w:rPr>
+                <w:sz w:val="16"/>
+              </w:rPr>
+              <w:t>January content calendar approved for every account</w:t>
+            </w:r>
+          </w:p>
+        </w:tc>
+      </w:tr>
+      <w:tr>
+        <w:tc>
+          <w:tcPr>
+            <w:tcW w:type="dxa" w:w="1984"/>
+          </w:tcPr>
+          <w:p>
+            <w:pPr>
+              <w:spacing w:after="0"/>
+            </w:pPr>
+            <w:r>
+              <w:rPr>
+                <w:sz w:val="16"/>
+              </w:rPr>
+              <w:t>By 20 December</w:t>
+            </w:r>
+          </w:p>
+        </w:tc>
+        <w:tc>
+          <w:tcPr>
+            <w:tcW w:type="dxa" w:w="7654"/>
+          </w:tcPr>
+          <w:p>
+            <w:pPr>
+              <w:spacing w:after="0"/>
+            </w:pPr>
+            <w:r>
+              <w:rPr>
+                <w:sz w:val="16"/>
+              </w:rPr>
+              <w:t>All January posts, designs and videos made, reviewed and approved</w:t>
+            </w:r>
+          </w:p>
+        </w:tc>
+      </w:tr>
+      <w:tr>
+        <w:tc>
+          <w:tcPr>
+            <w:tcW w:type="dxa" w:w="1984"/>
+          </w:tcPr>
+          <w:p>
+            <w:pPr>
+              <w:spacing w:after="0"/>
+            </w:pPr>
+            <w:r>
+              <w:rPr>
+                <w:sz w:val="16"/>
+              </w:rPr>
+              <w:t>21-31 December</w:t>
+            </w:r>
+          </w:p>
+        </w:tc>
+        <w:tc>
+          <w:tcPr>
+            <w:tcW w:type="dxa" w:w="7654"/>
+          </w:tcPr>
+          <w:p>
+            <w:pPr>
+              <w:spacing w:after="0"/>
+            </w:pPr>
+            <w:r>
+              <w:rPr>
+                <w:sz w:val="16"/>
+              </w:rPr>
+              <w:t>Everything scheduled; buffer time for last changes</w:t>
+            </w:r>
+          </w:p>
+        </w:tc>
+      </w:tr>
+      <w:tr>
+        <w:tc>
+          <w:tcPr>
+            <w:tcW w:type="dxa" w:w="1984"/>
+          </w:tcPr>
+          <w:p>
+            <w:pPr>
+              <w:spacing w:after="0"/>
+            </w:pPr>
+            <w:r>
+              <w:rPr>
+                <w:sz w:val="16"/>
+              </w:rPr>
+              <w:t>1 January</w:t>
+            </w:r>
+          </w:p>
+        </w:tc>
+        <w:tc>
+          <w:tcPr>
+            <w:tcW w:type="dxa" w:w="7654"/>
+          </w:tcPr>
+          <w:p>
+            <w:pPr>
+              <w:spacing w:after="0"/>
+            </w:pPr>
+            <w:r>
+              <w:rPr>
+                <w:sz w:val="16"/>
+              </w:rPr>
+              <w:t>Posts go live automatically as per the calendar</w:t>
+            </w:r>
+          </w:p>
+        </w:tc>
+      </w:tr>
+    </w:tbl>
+    <w:p>
+      <w:r>
+        <w:t>The same cycle repeats every month: next month's content is always ready before the month starts.</w:t>
+      </w:r>
+    </w:p>
+    <w:tbl>
+      <w:tblPr>
+        <w:tblStyle w:val="LightGrid-Accent1"/>
+        <w:tblW w:type="auto" w:w="0"/>
+        <w:tblLook w:firstColumn="1" w:firstRow="1" w:lastColumn="0" w:lastRow="0" w:noHBand="0" w:noVBand="1" w:val="04A0"/>
+      </w:tblPr>
+      <w:tblGrid>
+        <w:gridCol w:w="5270"/>
+        <w:gridCol w:w="5270"/>
+      </w:tblGrid>
+      <w:tr>
+        <w:tc>
+          <w:tcPr>
+            <w:tcW w:type="dxa" w:w="3402"/>
+          </w:tcPr>
+          <w:p>
+            <w:pPr>
+              <w:spacing w:after="0"/>
+            </w:pPr>
+            <w:r>
+              <w:rPr>
+                <w:sz w:val="16"/>
+              </w:rPr>
+            </w:r>
+            <w:r>
+              <w:rPr>
+                <w:b/>
+                <w:sz w:val="16"/>
+              </w:rPr>
+              <w:t>Add-ons (run anytime, outside the calendar)</w:t>
+            </w:r>
+          </w:p>
+        </w:tc>
+        <w:tc>
+          <w:tcPr>
+            <w:tcW w:type="dxa" w:w="6236"/>
           </w:tcPr>
           <w:p>
             <w:pPr>
@@ -1099,7 +1365,7 @@
       <w:tr>
         <w:tc>
           <w:tcPr>
-            <w:tcW w:type="dxa" w:w="1984"/>
+            <w:tcW w:type="dxa" w:w="3402"/>
           </w:tcPr>
           <w:p>
             <w:pPr>
@@ -1109,13 +1375,13 @@
               <w:rPr>
                 <w:sz w:val="16"/>
               </w:rPr>
-              <w:t>Start (month 1)</w:t>
+              <w:t>Latest news (24/7)</w:t>
             </w:r>
           </w:p>
         </w:tc>
         <w:tc>
           <w:tcPr>
-            <w:tcW w:type="dxa" w:w="7654"/>
+            <w:tcW w:type="dxa" w:w="6236"/>
           </w:tcPr>
           <w:p>
             <w:pPr>
@@ -1125,7 +1391,7 @@
               <w:rPr>
                 <w:sz w:val="16"/>
               </w:rPr>
-              <w:t>Research, monthly strategy, calendar, text posts for all accounts, fact check, approvals, auto-posting on Facebook, Instagram, Threads, X</w:t>
+              <w:t>Relevant news is turned into a post or story within minutes, sent for quick approval</w:t>
             </w:r>
           </w:p>
         </w:tc>
@@ -1133,7 +1399,7 @@
       <w:tr>
         <w:tc>
           <w:tcPr>
-            <w:tcW w:type="dxa" w:w="1984"/>
+            <w:tcW w:type="dxa" w:w="3402"/>
           </w:tcPr>
           <w:p>
             <w:pPr>
@@ -1143,13 +1409,13 @@
               <w:rPr>
                 <w:sz w:val="16"/>
               </w:rPr>
-              <w:t>Next (months 2-3)</w:t>
+              <w:t>Upload Studio</w:t>
             </w:r>
           </w:p>
         </w:tc>
         <w:tc>
           <w:tcPr>
-            <w:tcW w:type="dxa" w:w="7654"/>
+            <w:tcW w:type="dxa" w:w="6236"/>
           </w:tcPr>
           <w:p>
             <w:pPr>
@@ -1159,7 +1425,7 @@
               <w:rPr>
                 <w:sz w:val="16"/>
               </w:rPr>
-              <w:t>Branded images and carousels, Upload Studio (your photos and clips into posts/reels), 24/7 news posts, comment and message replies, LinkedIn and YouTube once approved</w:t>
+              <w:t>Your event photos and raw clips turned into posts, carousels or reels for chosen platforms</w:t>
             </w:r>
           </w:p>
         </w:tc>
@@ -1167,7 +1433,7 @@
       <w:tr>
         <w:tc>
           <w:tcPr>
-            <w:tcW w:type="dxa" w:w="1984"/>
+            <w:tcW w:type="dxa" w:w="3402"/>
           </w:tcPr>
           <w:p>
             <w:pPr>
@@ -1177,13 +1443,13 @@
               <w:rPr>
                 <w:sz w:val="16"/>
               </w:rPr>
-              <w:t>Later</w:t>
+              <w:t>Replies</w:t>
             </w:r>
           </w:p>
         </w:tc>
         <w:tc>
           <w:tcPr>
-            <w:tcW w:type="dxa" w:w="7654"/>
+            <w:tcW w:type="dxa" w:w="6236"/>
           </w:tcPr>
           <w:p>
             <w:pPr>
@@ -1193,7 +1459,41 @@
               <w:rPr>
                 <w:sz w:val="16"/>
               </w:rPr>
-              <w:t>Motion-graphic videos and reels, "Learn with UIC" video scripts and editing, full self-learning, merge into the SEO dashboard</w:t>
+              <w:t>Comments and messages answered, fact-checked; sensitive ones go to a person</w:t>
+            </w:r>
+          </w:p>
+        </w:tc>
+      </w:tr>
+      <w:tr>
+        <w:tc>
+          <w:tcPr>
+            <w:tcW w:type="dxa" w:w="3402"/>
+          </w:tcPr>
+          <w:p>
+            <w:pPr>
+              <w:spacing w:after="0"/>
+            </w:pPr>
+            <w:r>
+              <w:rPr>
+                <w:sz w:val="16"/>
+              </w:rPr>
+              <w:t>Self-learning</w:t>
+            </w:r>
+          </w:p>
+        </w:tc>
+        <w:tc>
+          <w:tcPr>
+            <w:tcW w:type="dxa" w:w="6236"/>
+          </w:tcPr>
+          <w:p>
+            <w:pPr>
+              <w:spacing w:after="0"/>
+            </w:pPr>
+            <w:r>
+              <w:rPr>
+                <w:sz w:val="16"/>
+              </w:rPr>
+              <w:t>Weekly lessons from approvals, reach and leads improve the next month's content</w:t>
             </w:r>
           </w:p>
         </w:tc>
@@ -2767,7 +3067,7 @@
               <w:rPr>
                 <w:sz w:val="16"/>
               </w:rPr>
-              <w:t>Start (text posts + auto-posting)</w:t>
+              <w:t>Core (research, writing, approvals, auto-posting)</w:t>
             </w:r>
           </w:p>
         </w:tc>

</xml_diff>